<commit_message>
Add 4 public official documents (GIPC-SCH-001, GIPC-POL-001, GIPC-POL-002, GIPC-PRO-003) without internal annexes and clean filenames
</commit_message>
<xml_diff>
--- a/backend/app/data/contracts/10_საგამოცდო_ხელშეკრულება.docx
+++ b/backend/app/data/contracts/10_საგამოცდო_ხელშეკრულება.docx
@@ -2361,8 +2361,8 @@
         </w:tblCellMar>
       </w:tblPr>
       <w:tblGrid>
-        <w:gridCol w:w="3500"/>
-        <w:gridCol w:w="6139"/>
+        <w:gridCol w:w="3100"/>
+        <w:gridCol w:w="6539"/>
       </w:tblGrid>
       <w:tr>
         <w:trPr>
@@ -2371,7 +2371,7 @@
         </w:trPr>
         <w:tc>
           <w:tcPr>
-            <w:tcW w:type="dxa" w:w="3500"/>
+            <w:tcW w:type="dxa" w:w="3100"/>
             <w:shd w:val="clear" w:color="auto" w:fill="F2F2F2"/>
             <w:vAlign w:val="center"/>
           </w:tcPr>
@@ -2394,7 +2394,7 @@
         </w:tc>
         <w:tc>
           <w:tcPr>
-            <w:tcW w:type="dxa" w:w="6139"/>
+            <w:tcW w:type="dxa" w:w="6539"/>
             <w:shd w:val="clear" w:color="auto" w:fill="F2F2F2"/>
             <w:vAlign w:val="center"/>
           </w:tcPr>
@@ -2422,7 +2422,7 @@
         </w:trPr>
         <w:tc>
           <w:tcPr>
-            <w:tcW w:type="dxa" w:w="3500"/>
+            <w:tcW w:type="dxa" w:w="3100"/>
             <w:vAlign w:val="center"/>
           </w:tcPr>
           <w:p>
@@ -2444,7 +2444,7 @@
         </w:tc>
         <w:tc>
           <w:tcPr>
-            <w:tcW w:type="dxa" w:w="6139"/>
+            <w:tcW w:type="dxa" w:w="6539"/>
             <w:vAlign w:val="center"/>
           </w:tcPr>
           <w:p>
@@ -2471,7 +2471,7 @@
         </w:trPr>
         <w:tc>
           <w:tcPr>
-            <w:tcW w:type="dxa" w:w="3500"/>
+            <w:tcW w:type="dxa" w:w="3100"/>
             <w:vAlign w:val="center"/>
           </w:tcPr>
           <w:p>
@@ -2493,7 +2493,7 @@
         </w:tc>
         <w:tc>
           <w:tcPr>
-            <w:tcW w:type="dxa" w:w="6139"/>
+            <w:tcW w:type="dxa" w:w="6539"/>
             <w:vAlign w:val="center"/>
           </w:tcPr>
           <w:p>
@@ -2861,8 +2861,8 @@
         </w:tblCellMar>
       </w:tblPr>
       <w:tblGrid>
-        <w:gridCol w:w="3500"/>
-        <w:gridCol w:w="6139"/>
+        <w:gridCol w:w="3100"/>
+        <w:gridCol w:w="6539"/>
       </w:tblGrid>
       <w:tr>
         <w:trPr>
@@ -2871,7 +2871,7 @@
         </w:trPr>
         <w:tc>
           <w:tcPr>
-            <w:tcW w:type="dxa" w:w="3500"/>
+            <w:tcW w:type="dxa" w:w="3100"/>
             <w:shd w:val="clear" w:color="auto" w:fill="F2F2F2"/>
             <w:vAlign w:val="center"/>
           </w:tcPr>
@@ -2894,7 +2894,7 @@
         </w:tc>
         <w:tc>
           <w:tcPr>
-            <w:tcW w:type="dxa" w:w="6139"/>
+            <w:tcW w:type="dxa" w:w="6539"/>
             <w:shd w:val="clear" w:color="auto" w:fill="F2F2F2"/>
             <w:vAlign w:val="center"/>
           </w:tcPr>
@@ -2922,7 +2922,7 @@
         </w:trPr>
         <w:tc>
           <w:tcPr>
-            <w:tcW w:type="dxa" w:w="3500"/>
+            <w:tcW w:type="dxa" w:w="3100"/>
             <w:vAlign w:val="center"/>
           </w:tcPr>
           <w:p>
@@ -2944,7 +2944,7 @@
         </w:tc>
         <w:tc>
           <w:tcPr>
-            <w:tcW w:type="dxa" w:w="6139"/>
+            <w:tcW w:type="dxa" w:w="6539"/>
             <w:vAlign w:val="center"/>
           </w:tcPr>
           <w:p>
@@ -2971,7 +2971,7 @@
         </w:trPr>
         <w:tc>
           <w:tcPr>
-            <w:tcW w:type="dxa" w:w="3500"/>
+            <w:tcW w:type="dxa" w:w="3100"/>
             <w:vAlign w:val="center"/>
           </w:tcPr>
           <w:p>
@@ -2993,7 +2993,7 @@
         </w:tc>
         <w:tc>
           <w:tcPr>
-            <w:tcW w:type="dxa" w:w="6139"/>
+            <w:tcW w:type="dxa" w:w="6539"/>
             <w:vAlign w:val="center"/>
           </w:tcPr>
           <w:p>
@@ -3020,7 +3020,7 @@
         </w:trPr>
         <w:tc>
           <w:tcPr>
-            <w:tcW w:type="dxa" w:w="3500"/>
+            <w:tcW w:type="dxa" w:w="3100"/>
             <w:vAlign w:val="center"/>
           </w:tcPr>
           <w:p>
@@ -3042,7 +3042,7 @@
         </w:tc>
         <w:tc>
           <w:tcPr>
-            <w:tcW w:type="dxa" w:w="6139"/>
+            <w:tcW w:type="dxa" w:w="6539"/>
             <w:vAlign w:val="center"/>
           </w:tcPr>
           <w:p>

</xml_diff>

<commit_message>
Sync updated contracts and public documents with actual office/exam center address (Mirian Mefe #98)
</commit_message>
<xml_diff>
--- a/backend/app/data/contracts/10_საგამოცდო_ხელშეკრულება.docx
+++ b/backend/app/data/contracts/10_საგამოცდო_ხელშეკრულება.docx
@@ -329,7 +329,7 @@
           <w:color w:val="000000"/>
           <w:sz w:val="21"/>
         </w:rPr>
-        <w:t>იურიდიული მისამართი: საქართველო, თბილისი, საბურთალოს რაიონი, იოსებიძის ქუჩა, №69, ბინა №28</w:t>
+        <w:t>მისამართი (ოფისი და საგამოცდო ცენტრი): საქართველო, ქ. თბილისი, მირიან მეფის ქ. №98, მე-2 სართული, საოფისე ფართი №6</w:t>
       </w:r>
     </w:p>
     <w:p>
@@ -1350,7 +1350,7 @@
           <w:color w:val="000000"/>
           <w:sz w:val="21"/>
         </w:rPr>
-        <w:t>2.2. გამოცდა ტარდება ელექტრონულად, ინსტიტუტის საგამოცდო აუდიტორიაში, სპეციალური საგამოცდო აპლიკაციის მეშვეობით.</w:t>
+        <w:t>2.2. გამოცდა ტარდება ელექტრონულად, ინსტიტუტის საგამოცდო აუდიტორიაში (მისამართი: ქ. თბილისი, მირიან მეფის ქ. №98, მე-2 სართული, საოფისე ფართი №6), სპეციალური საგამოცდო აპლიკაციის მეშვეობით.</w:t>
       </w:r>
     </w:p>
     <w:p>
@@ -1498,7 +1498,7 @@
           <w:color w:val="000000"/>
           <w:sz w:val="21"/>
         </w:rPr>
-        <w:t xml:space="preserve">3.2. კანდიდატი ვალდებულია გამოცხადდეს საგამოცდო აუდიტორიაში გამოცდის დაწყებამდე </w:t>
+        <w:t xml:space="preserve">3.2. კანდიდატი ვალდებულია გამოცხადდეს საგამოცდო აუდიტორიაში (ქ. თბილისი, მირიან მეფის ქ. №98, მე-2 სართული, საოფისე ფართი №6) გამოცდის დაწყებამდე </w:t>
       </w:r>
       <w:r>
         <w:rPr>

</xml_diff>